<commit_message>
ajusta gerador de rt com campos automaticos e textos prontos
Made-with: Cursor
</commit_message>
<xml_diff>
--- a/templates_docx/prestacao_contas/relatorio-tecnico-model.docx
+++ b/templates_docx/prestacao_contas/relatorio-tecnico-model.docx
@@ -3962,6 +3962,11 @@
           <w:lang w:val="en-US"/>
         </w:rPr>
         <w:t xml:space="preserve">}}</w:t>
+      </w:r>
+    </w:p>
+    <w:p>
+      <w:r>
+        <w:t>{{informacoes_complementares}}</w:t>
       </w:r>
     </w:p>
     <w:sectPr>

</xml_diff>